<commit_message>
Name who runs it and who executes, and put Justin in the weekly
Clent's feedback. Christy runs the engagement for Jewell Projects and
Harry executes inside Tap That, both said plainly at the top of Ways of
Working rather than left to be inferred from a RACI two sections later.

The weekly is now with Harry and Justin together, so direction and
execution do not drift apart between meetings, and the governance row in
the workstream table says the same.

This also retires the coverage line about Clent being overseas with
Christy carrying strategy in the room. That was my inference from the
transcript and I had flagged it as unconfirmed; with Christy named as the
lead it is neither needed nor accurate.

The quote is untouched pending Clent's answer on which price the $2,500
replaces.

Co-Authored-By: Claude Opus 5 <noreply@anthropic.com>
Claude-Session: https://claude.ai/code/session_01Asjqk2CJhNThgugfeWzXnb
</commit_message>
<xml_diff>
--- a/00 Admin/04 Commercial + SOW/JP_TapThat_Proposal_v02.docx
+++ b/00 Admin/04 Commercial + SOW/JP_TapThat_Proposal_v02.docx
@@ -4695,7 +4695,7 @@
                 <w:szCs w:val="22"/>
                 <w:rFonts w:ascii="Poppins" w:cs="Poppins" w:eastAsia="Poppins" w:hAnsi="Poppins"/>
               </w:rPr>
-              <w:t xml:space="preserve">Your 30-day item. A weekly 30 minutes with Harry, a monthly hour with the founders against the four numbers, and a review at each rung of your ladder.</w:t>
+              <w:t xml:space="preserve">Your 30-day item. A weekly 30 minutes with Harry and Justin, a monthly hour with both founders against the four numbers, and a review at each rung of your ladder.</w:t>
             </w:r>
           </w:p>
         </w:tc>
@@ -5616,7 +5616,7 @@
           <w:szCs w:val="22"/>
           <w:rFonts w:ascii="Poppins" w:cs="Poppins" w:eastAsia="Poppins" w:hAnsi="Poppins"/>
         </w:rPr>
-        <w:t xml:space="preserve">Weekly with Harry. </w:t>
+        <w:t xml:space="preserve">Christy runs it. </w:t>
       </w:r>
       <w:r>
         <w:rPr>
@@ -5625,7 +5625,7 @@
           <w:szCs w:val="22"/>
           <w:rFonts w:ascii="Poppins" w:cs="Poppins" w:eastAsia="Poppins" w:hAnsi="Poppins"/>
         </w:rPr>
-        <w:t xml:space="preserve">Thirty minutes: progress, blockers, what we need. Harry is the operator; everything we build is runnable by that seat.</w:t>
+        <w:t xml:space="preserve">Christy Kilmartin leads the engagement for Jewell Projects: strategy, direction, and the call on what gets built next. Your first call on anything.</w:t>
       </w:r>
     </w:p>
     <w:p>
@@ -5646,7 +5646,7 @@
           <w:szCs w:val="22"/>
           <w:rFonts w:ascii="Poppins" w:cs="Poppins" w:eastAsia="Poppins" w:hAnsi="Poppins"/>
         </w:rPr>
-        <w:t xml:space="preserve">Monthly with the founders. </w:t>
+        <w:t xml:space="preserve">Harry executes. </w:t>
       </w:r>
       <w:r>
         <w:rPr>
@@ -5655,7 +5655,7 @@
           <w:szCs w:val="22"/>
           <w:rFonts w:ascii="Poppins" w:cs="Poppins" w:eastAsia="Poppins" w:hAnsi="Poppins"/>
         </w:rPr>
-        <w:t xml:space="preserve">One hour against the four numbers. Decisions taken in the room and recorded.</w:t>
+        <w:t xml:space="preserve">Harry is the operator inside Tap That. Everything we design is built to be run from that seat, and the day-to-day sits with him.</w:t>
       </w:r>
     </w:p>
     <w:p>
@@ -5676,7 +5676,7 @@
           <w:szCs w:val="22"/>
           <w:rFonts w:ascii="Poppins" w:cs="Poppins" w:eastAsia="Poppins" w:hAnsi="Poppins"/>
         </w:rPr>
-        <w:t xml:space="preserve">Reviews on your ladder. </w:t>
+        <w:t xml:space="preserve">Weekly with Harry and Justin. </w:t>
       </w:r>
       <w:r>
         <w:rPr>
@@ -5685,7 +5685,7 @@
           <w:szCs w:val="22"/>
           <w:rFonts w:ascii="Poppins" w:cs="Poppins" w:eastAsia="Poppins" w:hAnsi="Poppins"/>
         </w:rPr>
-        <w:t xml:space="preserve">Mid-October, mid-December, March, September. A written review at each, and a stop-or-continue conversation at each.</w:t>
+        <w:t xml:space="preserve">Thirty minutes: progress, blockers, what we need next. Both of you in the room, so direction and execution do not drift apart between meetings.</w:t>
       </w:r>
     </w:p>
     <w:p>
@@ -5706,7 +5706,7 @@
           <w:szCs w:val="22"/>
           <w:rFonts w:ascii="Poppins" w:cs="Poppins" w:eastAsia="Poppins" w:hAnsi="Poppins"/>
         </w:rPr>
-        <w:t xml:space="preserve">One source of truth. </w:t>
+        <w:t xml:space="preserve">Monthly against the numbers. </w:t>
       </w:r>
       <w:r>
         <w:rPr>
@@ -5715,7 +5715,7 @@
           <w:szCs w:val="22"/>
           <w:rFonts w:ascii="Poppins" w:cs="Poppins" w:eastAsia="Poppins" w:hAnsi="Poppins"/>
         </w:rPr>
-        <w:t xml:space="preserve">Everything lives in the shared engagement folder and on the plan on a page. Nothing important travels only by text.</w:t>
+        <w:t xml:space="preserve">One hour with both founders on the four numbers. Decisions taken in the room and recorded.</w:t>
       </w:r>
     </w:p>
     <w:p>
@@ -5736,7 +5736,7 @@
           <w:szCs w:val="22"/>
           <w:rFonts w:ascii="Poppins" w:cs="Poppins" w:eastAsia="Poppins" w:hAnsi="Poppins"/>
         </w:rPr>
-        <w:t xml:space="preserve">Sign-off. </w:t>
+        <w:t xml:space="preserve">Reviews on your ladder. </w:t>
       </w:r>
       <w:r>
         <w:rPr>
@@ -5745,7 +5745,7 @@
           <w:szCs w:val="22"/>
           <w:rFonts w:ascii="Poppins" w:cs="Poppins" w:eastAsia="Poppins" w:hAnsi="Poppins"/>
         </w:rPr>
-        <w:t xml:space="preserve">One named person on your side, our suggestion is Justin with Chris consulted on brand and product, approves messaging, offers and anything that goes to market.</w:t>
+        <w:t xml:space="preserve">Mid-October, mid-December, March, September. A written review at each, and a stop-or-continue conversation at each.</w:t>
       </w:r>
     </w:p>
     <w:p>
@@ -5766,7 +5766,7 @@
           <w:szCs w:val="22"/>
           <w:rFonts w:ascii="Poppins" w:cs="Poppins" w:eastAsia="Poppins" w:hAnsi="Poppins"/>
         </w:rPr>
-        <w:t xml:space="preserve">Coverage. </w:t>
+        <w:t xml:space="preserve">One source of truth. </w:t>
       </w:r>
       <w:r>
         <w:rPr>
@@ -5775,7 +5775,37 @@
           <w:szCs w:val="22"/>
           <w:rFonts w:ascii="Poppins" w:cs="Poppins" w:eastAsia="Poppins" w:hAnsi="Poppins"/>
         </w:rPr>
-        <w:t xml:space="preserve">Clent is overseas from the end of September. The weekly rhythm continues online and Christy carries strategy in the room.</w:t>
+        <w:t xml:space="preserve">Everything lives in the shared engagement folder and on the plan on a page. Nothing important travels only by text.</w:t>
+      </w:r>
+    </w:p>
+    <w:p>
+      <w:pPr>
+        <w:pStyle w:val="ListParagraph"/>
+        <w:numPr>
+          <w:ilvl w:val="0"/>
+          <w:numId w:val="3"/>
+        </w:numPr>
+        <w:spacing w:line="360" w:after="80"/>
+      </w:pPr>
+      <w:r>
+        <w:rPr>
+          <w:b/>
+          <w:bCs/>
+          <w:color w:val="000000"/>
+          <w:sz w:val="22"/>
+          <w:szCs w:val="22"/>
+          <w:rFonts w:ascii="Poppins" w:cs="Poppins" w:eastAsia="Poppins" w:hAnsi="Poppins"/>
+        </w:rPr>
+        <w:t xml:space="preserve">Sign-off. </w:t>
+      </w:r>
+      <w:r>
+        <w:rPr>
+          <w:color w:val="000000"/>
+          <w:sz w:val="22"/>
+          <w:szCs w:val="22"/>
+          <w:rFonts w:ascii="Poppins" w:cs="Poppins" w:eastAsia="Poppins" w:hAnsi="Poppins"/>
+        </w:rPr>
+        <w:t xml:space="preserve">One named person on your side, our suggestion is Justin with Chris consulted on brand and product, approves messaging, offers and anything that goes to market.</w:t>
       </w:r>
     </w:p>
     <w:p>

</xml_diff>